<commit_message>
Protocolmanuscript BMJ Open: auteur van de Word-opmerkingen gewijzigd naar Janou De Buyser
Co-Authored-By: Claude Opus 5.5 <noreply@anthropic.com>
</commit_message>
<xml_diff>
--- a/protocol paper/BMJ Open/PARADISE_protocol_BMJOpen.docx
+++ b/protocol paper/BMJ Open/PARADISE_protocol_BMJOpen.docx
@@ -14840,7 +14840,7 @@
 
 <file path=word/comments.xml><?xml version="1.0" encoding="utf-8"?>
 <w:comments xmlns:w="http://schemas.openxmlformats.org/wordprocessingml/2006/main">
-  <w:comment w:id="0" w:author="Claude" w:initials="C" w:date="2026-10-19T12:00:00Z">
+  <w:comment w:id="0" w:author="Janou De Buyser" w:initials="JDB" w:date="2026-10-19T12:00:00Z">
     <w:p>
       <w:pPr>
         <w:pStyle w:val="Tekstopmerking"/>
@@ -14856,7 +14856,7 @@
       </w:r>
     </w:p>
   </w:comment>
-  <w:comment w:id="1" w:author="Claude" w:initials="C" w:date="2026-10-19T12:00:00Z">
+  <w:comment w:id="1" w:author="Janou De Buyser" w:initials="JDB" w:date="2026-10-19T12:00:00Z">
     <w:p>
       <w:pPr>
         <w:pStyle w:val="Tekstopmerking"/>
@@ -14872,7 +14872,7 @@
       </w:r>
     </w:p>
   </w:comment>
-  <w:comment w:id="2" w:author="Claude" w:initials="C" w:date="2026-10-19T12:00:00Z">
+  <w:comment w:id="2" w:author="Janou De Buyser" w:initials="JDB" w:date="2026-10-19T12:00:00Z">
     <w:p>
       <w:pPr>
         <w:pStyle w:val="Tekstopmerking"/>
@@ -14888,7 +14888,7 @@
       </w:r>
     </w:p>
   </w:comment>
-  <w:comment w:id="3" w:author="Claude" w:initials="C" w:date="2026-10-19T12:00:00Z">
+  <w:comment w:id="3" w:author="Janou De Buyser" w:initials="JDB" w:date="2026-10-19T12:00:00Z">
     <w:p>
       <w:pPr>
         <w:pStyle w:val="Tekstopmerking"/>
@@ -14904,7 +14904,7 @@
       </w:r>
     </w:p>
   </w:comment>
-  <w:comment w:id="4" w:author="Claude" w:initials="C" w:date="2026-10-19T12:00:00Z">
+  <w:comment w:id="4" w:author="Janou De Buyser" w:initials="JDB" w:date="2026-10-19T12:00:00Z">
     <w:p>
       <w:pPr>
         <w:pStyle w:val="Tekstopmerking"/>
@@ -14920,7 +14920,7 @@
       </w:r>
     </w:p>
   </w:comment>
-  <w:comment w:id="5" w:author="Claude" w:initials="C" w:date="2026-10-19T12:00:00Z">
+  <w:comment w:id="5" w:author="Janou De Buyser" w:initials="JDB" w:date="2026-10-19T12:00:00Z">
     <w:p>
       <w:pPr>
         <w:pStyle w:val="Tekstopmerking"/>
@@ -14936,7 +14936,7 @@
       </w:r>
     </w:p>
   </w:comment>
-  <w:comment w:id="6" w:author="Claude" w:initials="C" w:date="2026-10-19T12:00:00Z">
+  <w:comment w:id="6" w:author="Janou De Buyser" w:initials="JDB" w:date="2026-10-19T12:00:00Z">
     <w:p>
       <w:pPr>
         <w:pStyle w:val="Tekstopmerking"/>

</xml_diff>